<commit_message>
Implement automatic app attachments and multi-app support with numbered listings
</commit_message>
<xml_diff>
--- a/src/main/resources/templates/template.docx
+++ b/src/main/resources/templates/template.docx
@@ -578,11 +578,39 @@
       </w:pPr>
       <w:r>
         <w:rPr/>
-        <w:t>{LETTER_BODY}</w:t>
-        <w:br/>
-        <w:br/>
-        <w:br/>
-        <w:br/>
+        <w:t>{LETTER_BODY</w:t>
+      </w:r>
+      <w:r>
+        <w:rPr/>
+        <w:t>}</w:t>
+      </w:r>
+    </w:p>
+    <w:p>
+      <w:pPr>
+        <w:pStyle w:val="Normal"/>
+        <w:rPr/>
+      </w:pPr>
+      <w:r>
+        <w:rPr/>
+      </w:r>
+    </w:p>
+    <w:p>
+      <w:pPr>
+        <w:pStyle w:val="Normal"/>
+        <w:rPr/>
+      </w:pPr>
+      <w:r>
+        <w:rPr/>
+        <w:t>{ATTACHMENTS_LIST}</w:t>
+      </w:r>
+    </w:p>
+    <w:p>
+      <w:pPr>
+        <w:pStyle w:val="Normal"/>
+        <w:rPr/>
+      </w:pPr>
+      <w:r>
+        <w:rPr/>
       </w:r>
     </w:p>
     <w:p>

</xml_diff>